<commit_message>
Docs: Polish 10-page technical report tables and architecture diagram
</commit_message>
<xml_diff>
--- a/reports/MLOps_Assignment_1_Report.docx
+++ b/reports/MLOps_Assignment_1_Report.docx
@@ -757,7 +757,7 @@
       <w:r>
         <w:drawing>
           <wp:inline xmlns:a="http://schemas.openxmlformats.org/drawingml/2006/main" xmlns:pic="http://schemas.openxmlformats.org/drawingml/2006/picture">
-            <wp:extent cx="5760720" cy="2504860"/>
+            <wp:extent cx="5760720" cy="2200484"/>
             <wp:docPr id="9" name="Picture 9"/>
             <wp:cNvGraphicFramePr>
               <a:graphicFrameLocks noChangeAspect="1"/>
@@ -778,7 +778,7 @@
                   <pic:spPr>
                     <a:xfrm>
                       <a:off x="0" y="0"/>
-                      <a:ext cx="5760720" cy="2504860"/>
+                      <a:ext cx="5760720" cy="2200484"/>
                     </a:xfrm>
                     <a:prstGeom prst="rect"/>
                   </pic:spPr>

</xml_diff>